<commit_message>
Simplifica ETL e remove comentários
</commit_message>
<xml_diff>
--- a/docs/artigo/Artigo_DW_AdventureWorks.docx
+++ b/docs/artigo/Artigo_DW_AdventureWorks.docx
@@ -10929,7 +10929,7 @@
                 <w:b w:val="0"/>
                 <w:sz w:val="20"/>
               </w:rPr>
-              <w:t>Executa dez consultas SQL na origem (produtos, custos, territórios, clientes, endereços, vendedores, promoções, métodos de envio, cotas e vendas) e carrega o resultado em DataFrames do pandas.</w:t>
+              <w:t>Executa nove consultas SQL na origem (produtos, territórios, clientes, endereços, vendedores, promoções, métodos de envio, cotas e vendas) e carrega o resultado em DataFrames do pandas. A consulta de vendas já traz o custo padrão vigente na data do pedido.</w:t>
             </w:r>
           </w:p>
         </w:tc>
@@ -10991,7 +10991,7 @@
                 <w:b w:val="0"/>
                 <w:sz w:val="20"/>
               </w:rPr>
-              <w:t>Gera a dim_tempo; desnormaliza a hierarquia de produto; traduz códigos (linha, classe, estilo); substitui nulos por "Não informado"; unifica pessoas e lojas na dim_cliente; cria o membro "Venda online"; atribui chaves substitutas; busca o custo vigente na data do pedido; calcula valores bruto, desconto, líquido, custo e lucro; rateia frete e impostos pela participação do item no subtotal; resolve as chaves estrangeiras e interrompe a carga se alguma não for encontrada.</w:t>
+              <w:t>Gera a dim_tempo; desnormaliza a hierarquia de produto; traduz códigos (linha, classe, estilo); substitui nulos por "Não informado"; unifica pessoas e lojas na dim_cliente; cria o membro "Venda online"; atribui chaves substitutas; calcula valores bruto, desconto, líquido, custo e lucro; rateia frete e impostos pela participação do item no subtotal; resolve as chaves estrangeiras e interrompe a carga se alguma não for encontrada.</w:t>
             </w:r>
           </w:p>
         </w:tc>
@@ -11053,7 +11053,7 @@
                 <w:b w:val="0"/>
                 <w:sz w:val="20"/>
               </w:rPr>
-              <w:t>Recria o schema a partir de sql/01_create_dw.sql, carrega dimensões e depois fatos com o comando COPY do PostgreSQL (carga em massa), ajusta as sequences e registra cada tabela em dw.etl_execucao.</w:t>
+              <w:t>Recria o schema a partir de sql/01_create_dw.sql, grava dimensões e depois fatos com o método to_sql do pandas, registra cada tabela em dw.etl_execucao e cria as views dos indicadores (sql/02_kpis_views.sql).</w:t>
             </w:r>
           </w:p>
         </w:tc>
@@ -11075,7 +11075,7 @@
                 <w:b w:val="0"/>
                 <w:sz w:val="20"/>
               </w:rPr>
-              <w:t>Publicação</w:t>
+              <w:t>Orquestração</w:t>
             </w:r>
           </w:p>
         </w:tc>
@@ -11115,7 +11115,7 @@
                 <w:b w:val="0"/>
                 <w:sz w:val="20"/>
               </w:rPr>
-              <w:t>Cria as views dos indicadores (sql/02_kpis_views.sql) e exibe a receita total carregada para conferência.</w:t>
+              <w:t>Chama as três etapas em sequência e exibe o tempo total de execução.</w:t>
             </w:r>
           </w:p>
         </w:tc>
@@ -11168,7 +11168,7 @@
           <w:rFonts w:ascii="Arial" w:hAnsi="Arial"/>
           <w:sz w:val="24"/>
         </w:rPr>
-        <w:t xml:space="preserve">: para cada item, a ETL localiza em </w:t>
+        <w:t xml:space="preserve">: para cada item, a consulta de extração localiza em </w:t>
       </w:r>
       <w:r>
         <w:rPr>
@@ -11212,7 +11212,7 @@
           <w:rFonts w:ascii="Arial" w:hAnsi="Arial"/>
           <w:sz w:val="24"/>
         </w:rPr>
-        <w:t xml:space="preserve">A execução completa leva cerca de 13 segundos. A validação consistiu em comparar a receita carregada no DW (US$ 109,8 milhões) com a soma da coluna </w:t>
+        <w:t xml:space="preserve">A execução completa leva cerca de 35 segundos. A validação consistiu em comparar a receita carregada no DW (US$ 109,8 milhões) com a soma da coluna </w:t>
       </w:r>
       <w:r>
         <w:rPr>

</xml_diff>